<commit_message>
docs: update AITU title pages and supervisor details
Record the supplied academic identity and team-reported hackathon win. Preserve the distinction between reported achievement and documented user interviews.
</commit_message>
<xml_diff>
--- a/docs/diploma/deliverables/Hattama_PreDefense_Report.docx
+++ b/docs/diploma/deliverables/Hattama_PreDefense_Report.docx
@@ -4,30 +4,244 @@
   <w:body>
     <w:p>
       <w:pPr>
+        <w:keepNext w:val="0"/>
+        <w:spacing w:before="0" w:after="160"/>
+        <w:jc w:val="center"/>
+      </w:pPr>
+      <w:r>
+        <w:rPr>
+          <w:b/>
+          <w:color w:val="000000"/>
+          <w:sz w:val="36"/>
+        </w:rPr>
+        <w:t>Astana IT University</w:t>
+      </w:r>
+    </w:p>
+    <w:p>
+      <w:pPr>
+        <w:keepNext w:val="0"/>
+        <w:spacing w:before="0" w:after="100"/>
+        <w:jc w:val="center"/>
+      </w:pPr>
+      <w:r>
+        <w:rPr>
+          <w:b w:val="0"/>
+          <w:color w:val="000000"/>
+          <w:sz w:val="26"/>
+        </w:rPr>
+        <w:t>School of Software Engineering</w:t>
+      </w:r>
+    </w:p>
+    <w:p>
+      <w:pPr>
+        <w:keepNext w:val="0"/>
+        <w:spacing w:before="0" w:after="100"/>
+        <w:jc w:val="center"/>
+      </w:pPr>
+      <w:r>
+        <w:rPr>
+          <w:b w:val="0"/>
+          <w:color w:val="000000"/>
+          <w:sz w:val="24"/>
+        </w:rPr>
+        <w:t>Software Engineering</w:t>
+      </w:r>
+    </w:p>
+    <w:p>
+      <w:pPr>
+        <w:keepNext w:val="0"/>
+        <w:spacing w:before="0" w:after="560"/>
+        <w:jc w:val="center"/>
+      </w:pPr>
+      <w:r>
+        <w:rPr>
+          <w:b w:val="0"/>
+          <w:color w:val="000000"/>
+          <w:sz w:val="24"/>
+        </w:rPr>
+        <w:t>Group SE-2403</w:t>
+      </w:r>
+    </w:p>
+    <w:p>
+      <w:pPr>
         <w:pStyle w:val="Title"/>
-      </w:pPr>
-      <w:r>
+        <w:keepNext w:val="0"/>
+        <w:spacing w:before="0" w:after="280"/>
+        <w:jc w:val="center"/>
+      </w:pPr>
+      <w:r>
+        <w:rPr>
+          <w:b/>
+          <w:color w:val="000000"/>
+          <w:sz w:val="52"/>
+        </w:rPr>
         <w:t>Hattama</w:t>
       </w:r>
     </w:p>
     <w:p>
       <w:pPr>
-        <w:pStyle w:val="Subtitle"/>
-      </w:pPr>
-      <w:r>
+        <w:keepNext w:val="0"/>
+        <w:spacing w:before="0" w:after="440"/>
+        <w:jc w:val="center"/>
+      </w:pPr>
+      <w:r>
+        <w:rPr>
+          <w:b/>
+          <w:color w:val="000000"/>
+          <w:sz w:val="34"/>
+        </w:rPr>
         <w:t>Development of a Platform for Automated Meeting Minutes Generation in Kazakh and Russian Using Neural Network Models</w:t>
       </w:r>
     </w:p>
     <w:p>
-      <w:r>
-        <w:t>First pre-defense analysis and design package</w:t>
+      <w:pPr>
+        <w:keepNext w:val="0"/>
+        <w:spacing w:before="0" w:after="520"/>
+        <w:jc w:val="center"/>
+      </w:pPr>
+      <w:r>
+        <w:rPr>
+          <w:b w:val="0"/>
+          <w:color w:val="000000"/>
+          <w:sz w:val="26"/>
+        </w:rPr>
+        <w:t>Diploma Project</w:t>
         <w:br/>
-        <w:t>23 October 2026</w:t>
-      </w:r>
-    </w:p>
-    <w:p>
-      <w:r>
-        <w:t>This report updates the existing diploma analysis and design package to match Hattama, the implemented local meeting-minutes application. It covers uploaded Kazakh and Russian audio, local speech recognition and speaker attribution, neural draft generation, editable review fields and saved DOCX export. Live meeting connection remains a planned extension. The eleven assessment areas distinguish implementation evidence, research findings and work still pending.</w:t>
+        <w:t>First Pre-defense Report</w:t>
+      </w:r>
+    </w:p>
+    <w:p>
+      <w:pPr>
+        <w:keepNext w:val="0"/>
+        <w:spacing w:before="0" w:after="480"/>
+        <w:jc w:val="center"/>
+      </w:pPr>
+      <w:r>
+        <w:rPr>
+          <w:b w:val="0"/>
+          <w:color w:val="000000"/>
+          <w:sz w:val="24"/>
+        </w:rPr>
+        <w:t>Prepared by</w:t>
+        <w:br/>
+        <w:t>Akhmetov Kazbek</w:t>
+        <w:br/>
+        <w:t>Uranov Daryn</w:t>
+        <w:br/>
+        <w:t>Tazhibayev Marsel</w:t>
+      </w:r>
+    </w:p>
+    <w:p>
+      <w:pPr>
+        <w:keepNext w:val="0"/>
+        <w:spacing w:before="0" w:after="600"/>
+        <w:jc w:val="center"/>
+      </w:pPr>
+      <w:r>
+        <w:rPr>
+          <w:b w:val="0"/>
+          <w:color w:val="000000"/>
+          <w:sz w:val="24"/>
+        </w:rPr>
+        <w:t>Supervisor</w:t>
+        <w:br/>
+        <w:t>Aitmukhanbetova Elvira</w:t>
+        <w:br/>
+        <w:t>Senior Lecturer</w:t>
+      </w:r>
+    </w:p>
+    <w:p>
+      <w:pPr>
+        <w:keepNext w:val="0"/>
+        <w:spacing w:before="0" w:after="0"/>
+        <w:jc w:val="center"/>
+      </w:pPr>
+      <w:r>
+        <w:rPr>
+          <w:b w:val="0"/>
+          <w:color w:val="000000"/>
+          <w:sz w:val="24"/>
+        </w:rPr>
+        <w:t>Astana</w:t>
+        <w:br/>
+        <w:t>2026</w:t>
+      </w:r>
+    </w:p>
+    <w:p>
+      <w:pPr>
+        <w:pStyle w:val="Heading1"/>
+      </w:pPr>
+      <w:r>
+        <w:t>Contents</w:t>
+      </w:r>
+    </w:p>
+    <w:p>
+      <w:r>
+        <w:t>1. Hattama project proposal and scope</w:t>
+      </w:r>
+    </w:p>
+    <w:p>
+      <w:r>
+        <w:t>2. Relevance and evidence of user needs</w:t>
+      </w:r>
+    </w:p>
+    <w:p>
+      <w:r>
+        <w:t>3. Literature review</w:t>
+      </w:r>
+    </w:p>
+    <w:p>
+      <w:r>
+        <w:t>4. Existing system comparison</w:t>
+      </w:r>
+    </w:p>
+    <w:p>
+      <w:r>
+        <w:t>5. Technology and model comparison</w:t>
+      </w:r>
+    </w:p>
+    <w:p>
+      <w:r>
+        <w:t>6. Requirements specification</w:t>
+      </w:r>
+    </w:p>
+    <w:p>
+      <w:r>
+        <w:t>7. Hattama architecture and data design</w:t>
+      </w:r>
+    </w:p>
+    <w:p>
+      <w:r>
+        <w:t>8. Working interface and demonstration</w:t>
+      </w:r>
+    </w:p>
+    <w:p>
+      <w:r>
+        <w:t>9. Verification and evaluation plan</w:t>
+      </w:r>
+    </w:p>
+    <w:p>
+      <w:r>
+        <w:t>10. Project management and risks</w:t>
+      </w:r>
+    </w:p>
+    <w:p>
+      <w:r>
+        <w:t>11. Supervisor review and response</w:t>
+      </w:r>
+    </w:p>
+    <w:p>
+      <w:r>
+        <w:t>12. References</w:t>
+      </w:r>
+    </w:p>
+    <w:p>
+      <w:r>
+        <w:t>Appendix A. Architecture diagrams</w:t>
+        <w:br/>
+        <w:t>Appendix B. Requirements traceability</w:t>
+        <w:br/>
+        <w:t>Appendix C. Remaining manual work</w:t>
       </w:r>
     </w:p>
     <w:p>
@@ -35,7 +249,38 @@
         <w:pStyle w:val="Heading2"/>
       </w:pPr>
       <w:r>
-        <w:t>Project team</w:t>
+        <w:t>Companion package</w:t>
+      </w:r>
+    </w:p>
+    <w:p>
+      <w:r>
+        <w:t>The repository package contains English source documents, a 35-source register including eleven scientific publications, three-system comparison, seven technical decisions including four generation models, 21 functional and 13 nonfunctional requirements, four editable diagrams, the working application demo guide, an evaluation plan and 33 planning tasks. Historical hackathon measurements are explicitly separated from fresh checks and proposed targets.</w:t>
+      </w:r>
+    </w:p>
+    <w:p>
+      <w:pPr>
+        <w:pStyle w:val="Heading1"/>
+      </w:pPr>
+      <w:r>
+        <w:t>Hattama project proposal and scope</w:t>
+      </w:r>
+    </w:p>
+    <w:p>
+      <w:pPr>
+        <w:pStyle w:val="Heading2"/>
+      </w:pPr>
+      <w:r>
+        <w:t>Project identity</w:t>
+      </w:r>
+    </w:p>
+    <w:p>
+      <w:r>
+        <w:t>Development of a Platform for Automated Meeting Minutes Generation in Kazakh and Russian Using Neural Network Models</w:t>
+      </w:r>
+    </w:p>
+    <w:p>
+      <w:r>
+        <w:t>Hattama is an existing local meeting-minutes application developed during a hackathon. This diploma project extends and evaluates that application. A user uploads a recording, supplies meeting context, inspects the generated transcript and tasks, saves corrections and exports a DOCX. The first pre-defense submission combines the existing implementation with an updated research and engineering specification. Baseline source: commit 13d2271 [S35].</w:t>
       </w:r>
     </w:p>
     <w:tbl>
@@ -110,7 +355,7 @@
                 <w:color w:val="FFFFFF"/>
                 <w:sz w:val="19"/>
               </w:rPr>
-              <w:t>Responsibility</w:t>
+              <w:t>Diploma responsibility</w:t>
             </w:r>
           </w:p>
         </w:tc>
@@ -167,7 +412,7 @@
                 <w:color w:val="18283E"/>
                 <w:sz w:val="19"/>
               </w:rPr>
-              <w:t>Frontend and backend</w:t>
+              <w:t>Frontend and backend integration, recording workflow, persisted review and exports</w:t>
             </w:r>
           </w:p>
         </w:tc>
@@ -224,7 +469,7 @@
                 <w:color w:val="18283E"/>
                 <w:sz w:val="19"/>
               </w:rPr>
-              <w:t>Machine learning and backend</w:t>
+              <w:t>Speech and language models, diarization, evaluation data and reproducible experiments</w:t>
             </w:r>
           </w:p>
         </w:tc>
@@ -281,7 +526,7 @@
                 <w:color w:val="18283E"/>
                 <w:sz w:val="19"/>
               </w:rPr>
-              <w:t>Team lead and workflow coordination</w:t>
+              <w:t>Team lead, shared contracts, scope, integration, review and submission coordination</w:t>
             </w:r>
           </w:p>
         </w:tc>
@@ -294,7 +539,7 @@
     </w:p>
     <w:p>
       <w:r>
-        <w:t>Supervisor: Elvira Aitmukhambetovna</w:t>
+        <w:t>Supervisor: Aitmukhanbetova Elvira, Senior Lecturer. The team reports that the topic is agreed. Institution: Astana IT University, School of Software Engineering. Programme: Software Engineering. Group: SE-2403. Submission year: 2026. The final defense date remains to be confirmed. Individual Git accounts must be mapped to these real names by the team; this report does not infer identity from nicknames.</w:t>
       </w:r>
     </w:p>
     <w:p>
@@ -302,12 +547,101 @@
         <w:pStyle w:val="Heading2"/>
       </w:pPr>
       <w:r>
-        <w:t>Submission status</w:t>
-      </w:r>
-    </w:p>
-    <w:p>
-      <w:r>
-        <w:t>Working hackathon baseline: github.com/f0nce/hattama, commit 13d2271. This documentation update preserves the application. Published research supports relevance; illustrative scenarios are labelled. The supervisor review is a draft for confirmation. The team reports an existing YouTrack project, but its URL, access and task mapping remain pending. Teammate review and a submission tag are still required.</w:t>
+        <w:t>Problem and target users</w:t>
+      </w:r>
+    </w:p>
+    <w:p>
+      <w:r>
+        <w:t>Meeting coordinators and secretaries need to turn discussions into accurate summaries and actionable tasks. Code-switching, overlapping speech, uncertain names and relative dates can make automatic output unreliable. Published research establishes the relevance of evidence alignment and user correction [S06, S07, S28]. The repository records an omitted deadline and an incorrect summary in one model run [S35]. The prevalence and cost of these problems among Kazakhstan users remain to be established locally.</w:t>
+      </w:r>
+    </w:p>
+    <w:p>
+      <w:r>
+        <w:t>Primary users are coordinators, secretaries and project-team members who prepare minutes on a local computer. A human checks the resulting document before sharing it. The current application has no separate authenticated reviewer or administrator accounts. Local operating-system access is the security boundary; a shared web service is outside the delivered baseline.</w:t>
+      </w:r>
+    </w:p>
+    <w:p>
+      <w:pPr>
+        <w:pStyle w:val="Heading2"/>
+      </w:pPr>
+      <w:r>
+        <w:t>Aim and objectives</w:t>
+      </w:r>
+    </w:p>
+    <w:p>
+      <w:r>
+        <w:t>The aim is to develop and evaluate an offline-capable platform that reduces active preparation effort while producing reviewable Kazakh and Russian meeting minutes.</w:t>
+      </w:r>
+    </w:p>
+    <w:p>
+      <w:r>
+        <w:t>1. Establish user needs using published evidence and actual user discussions, with assumptions explicitly separated.</w:t>
+      </w:r>
+    </w:p>
+    <w:p>
+      <w:r>
+        <w:t>2. Preserve and document the working recording-to-DOCX flow and its local processing boundary.</w:t>
+      </w:r>
+    </w:p>
+    <w:p>
+      <w:r>
+        <w:t>3. Evaluate Kazakh, Russian and mixed-speech transcription and speaker attribution on independently annotated data.</w:t>
+      </w:r>
+    </w:p>
+    <w:p>
+      <w:r>
+        <w:t>4. Compare the current generator with feasible local alternatives and an extractive baseline using the same meeting tasks.</w:t>
+      </w:r>
+    </w:p>
+    <w:p>
+      <w:r>
+        <w:t>5. Improve measured errors in task owners, deadlines, evidence references and summary faithfulness.</w:t>
+      </w:r>
+    </w:p>
+    <w:p>
+      <w:r>
+        <w:t>6. Explore live meeting ingestion only after an explicit feasibility gate; retain upload as the working baseline.</w:t>
+      </w:r>
+    </w:p>
+    <w:p>
+      <w:pPr>
+        <w:pStyle w:val="Heading2"/>
+      </w:pPr>
+      <w:r>
+        <w:t>Implemented baseline and planned development</w:t>
+      </w:r>
+    </w:p>
+    <w:p>
+      <w:r>
+        <w:t>The baseline uses React/Vite with TypeScript, FastAPI, SQLite, local audio files and a separate Python worker. The bundled pipeline uses mixed-CTC speech recognition, sherpa-onnx speaker diarization and a 4-bit Qwen3-4B-Instruct-2507 checkpoint. Mac uses MLX; the Windows path executes the quantized checkpoint through a PyTorch adapter. Weights and hashes are pinned [S21, S33–S35].</w:t>
+      </w:r>
+    </w:p>
+    <w:p>
+      <w:r>
+        <w:t>Implemented input formats are WAV, MP3, M4A and FLAC with a default 100 MiB upload limit. The application preserves the machine result and the latest saved correction. Participants, tasks and summary are editable; transcript segments and source metadata are not editable in the current review API. Export uses one saved revision. This is a useful application, not a complete multiuser approval system.</w:t>
+      </w:r>
+    </w:p>
+    <w:p>
+      <w:r>
+        <w:t>Diploma extensions prioritise bilingual evaluation, error reduction, usable review and performance measurement. Live connection is planned research/development, not an implemented feature. The earlier 500 MB/60-minute specification is superseded by the actual baseline: 100 MiB; supported recording duration must be measured rather than claimed. Native mobile apps, several meeting providers and automatic external task execution remain outside the current scope.</w:t>
+      </w:r>
+    </w:p>
+    <w:p>
+      <w:pPr>
+        <w:pStyle w:val="Heading2"/>
+      </w:pPr>
+      <w:r>
+        <w:t>Expected outcomes and engineering contribution</w:t>
+      </w:r>
+    </w:p>
+    <w:p>
+      <w:r>
+        <w:t>Expected outcomes are a reproducible Hattama release, a coherent English documentation package, editable diagrams, a traceable task/review history and a controlled evaluation of accuracy, performance and user effort. The diploma contribution builds on the hackathon baseline through documented research, verified improvements and evaluation; it must not present inherited code as newly developed work.</w:t>
+      </w:r>
+    </w:p>
+    <w:p>
+      <w:r>
+        <w:t>Engineering complexity includes process isolation, durable queued jobs, audio decoding, model orchestration, source-linked task extraction, schema validation, transactional review revisions and consistent DOCX export. Neither a larger model nor a passing interface test proves minutes quality. The first pre-defense may present implementation plus an evaluation plan without claiming completed final experiments.</w:t>
       </w:r>
     </w:p>
     <w:p>
@@ -315,76 +649,7 @@
         <w:pStyle w:val="Heading1"/>
       </w:pPr>
       <w:r>
-        <w:t>Contents</w:t>
-      </w:r>
-    </w:p>
-    <w:p>
-      <w:r>
-        <w:t>1. Hattama project proposal and scope</w:t>
-      </w:r>
-    </w:p>
-    <w:p>
-      <w:r>
-        <w:t>2. Relevance and evidence of user needs</w:t>
-      </w:r>
-    </w:p>
-    <w:p>
-      <w:r>
-        <w:t>3. Literature review</w:t>
-      </w:r>
-    </w:p>
-    <w:p>
-      <w:r>
-        <w:t>4. Existing system comparison</w:t>
-      </w:r>
-    </w:p>
-    <w:p>
-      <w:r>
-        <w:t>5. Technology and model comparison</w:t>
-      </w:r>
-    </w:p>
-    <w:p>
-      <w:r>
-        <w:t>6. Requirements specification</w:t>
-      </w:r>
-    </w:p>
-    <w:p>
-      <w:r>
-        <w:t>7. Hattama architecture and data design</w:t>
-      </w:r>
-    </w:p>
-    <w:p>
-      <w:r>
-        <w:t>8. Working interface and demonstration</w:t>
-      </w:r>
-    </w:p>
-    <w:p>
-      <w:r>
-        <w:t>9. Verification and evaluation plan</w:t>
-      </w:r>
-    </w:p>
-    <w:p>
-      <w:r>
-        <w:t>10. Project management and risks</w:t>
-      </w:r>
-    </w:p>
-    <w:p>
-      <w:r>
-        <w:t>11. Supervisor review and response</w:t>
-      </w:r>
-    </w:p>
-    <w:p>
-      <w:r>
-        <w:t>12. References</w:t>
-      </w:r>
-    </w:p>
-    <w:p>
-      <w:r>
-        <w:t>Appendix A. Architecture diagrams</w:t>
-        <w:br/>
-        <w:t>Appendix B. Requirements traceability</w:t>
-        <w:br/>
-        <w:t>Appendix C. Remaining manual work</w:t>
+        <w:t>Relevance and evidence of user needs</w:t>
       </w:r>
     </w:p>
     <w:p>
@@ -392,420 +657,12 @@
         <w:pStyle w:val="Heading2"/>
       </w:pPr>
       <w:r>
-        <w:t>Companion package</w:t>
-      </w:r>
-    </w:p>
-    <w:p>
-      <w:r>
-        <w:t>The repository package contains English source documents, a 35-source register including eleven scientific publications, three-system comparison, seven technical decisions including four generation models, 21 functional and 13 nonfunctional requirements, four editable diagrams, the working application demo guide, an evaluation plan and 33 planning tasks. Historical hackathon measurements are explicitly separated from fresh checks and proposed targets.</w:t>
-      </w:r>
-    </w:p>
-    <w:p>
-      <w:pPr>
-        <w:pStyle w:val="Heading1"/>
-      </w:pPr>
-      <w:r>
-        <w:t>Hattama project proposal and scope</w:t>
-      </w:r>
-    </w:p>
-    <w:p>
-      <w:pPr>
-        <w:pStyle w:val="Heading2"/>
-      </w:pPr>
-      <w:r>
-        <w:t>Project identity</w:t>
-      </w:r>
-    </w:p>
-    <w:p>
-      <w:r>
-        <w:t>Development of a Platform for Automated Meeting Minutes Generation in Kazakh and Russian Using Neural Network Models</w:t>
-      </w:r>
-    </w:p>
-    <w:p>
-      <w:r>
-        <w:t>Hattama is an existing local meeting-minutes application developed during a hackathon. This diploma project extends and evaluates that application. A user uploads a recording, supplies meeting context, inspects the generated transcript and tasks, saves corrections and exports a DOCX. The first pre-defense submission combines the existing implementation with an updated research and engineering specification. Baseline source: commit 13d2271 [S35].</w:t>
-      </w:r>
-    </w:p>
-    <w:tbl>
-      <w:tblPr>
-        <w:tblW w:type="auto" w:w="0"/>
-        <w:jc w:val="center"/>
-        <w:tblLayout w:type="fixed"/>
-        <w:tblLook w:firstColumn="1" w:firstRow="1" w:lastColumn="0" w:lastRow="0" w:noHBand="0" w:noVBand="1" w:val="04A0"/>
-        <w:tblBorders>
-          <w:top w:val="single" w:sz="4" w:color="D9D9D9"/>
-          <w:left w:val="single" w:sz="4" w:color="D9D9D9"/>
-          <w:bottom w:val="single" w:sz="4" w:color="D9D9D9"/>
-          <w:right w:val="single" w:sz="4" w:color="D9D9D9"/>
-          <w:insideH w:val="single" w:sz="4" w:color="D9D9D9"/>
-          <w:insideV w:val="single" w:sz="4" w:color="D9D9D9"/>
-        </w:tblBorders>
-      </w:tblPr>
-      <w:tblGrid>
-        <w:gridCol w:w="2592"/>
-        <w:gridCol w:w="7632"/>
-      </w:tblGrid>
-      <w:tr>
-        <w:trPr>
-          <w:cantSplit/>
-          <w:tblHeader/>
-        </w:trPr>
-        <w:tc>
-          <w:tcPr>
-            <w:tcW w:type="dxa" w:w="2592"/>
-            <w:vAlign w:val="center"/>
-            <w:shd w:fill="243F66"/>
-            <w:tcMar>
-              <w:top w:w="90" w:type="dxa"/>
-              <w:left w:w="90" w:type="dxa"/>
-              <w:bottom w:w="90" w:type="dxa"/>
-              <w:right w:w="90" w:type="dxa"/>
-            </w:tcMar>
-          </w:tcPr>
-          <w:p>
-            <w:pPr>
-              <w:spacing w:after="40" w:before="40" w:line="245" w:lineRule="auto"/>
-            </w:pPr>
-            <w:r>
-              <w:rPr>
-                <w:b/>
-                <w:color w:val="FFFFFF"/>
-                <w:sz w:val="19"/>
-              </w:rPr>
-              <w:t>Member</w:t>
-            </w:r>
-          </w:p>
-        </w:tc>
-        <w:tc>
-          <w:tcPr>
-            <w:tcW w:type="dxa" w:w="7632"/>
-            <w:vAlign w:val="center"/>
-            <w:shd w:fill="243F66"/>
-            <w:tcMar>
-              <w:top w:w="90" w:type="dxa"/>
-              <w:left w:w="90" w:type="dxa"/>
-              <w:bottom w:w="90" w:type="dxa"/>
-              <w:right w:w="90" w:type="dxa"/>
-            </w:tcMar>
-          </w:tcPr>
-          <w:p>
-            <w:pPr>
-              <w:spacing w:after="40" w:before="40" w:line="245" w:lineRule="auto"/>
-            </w:pPr>
-            <w:r>
-              <w:rPr>
-                <w:b/>
-                <w:color w:val="FFFFFF"/>
-                <w:sz w:val="19"/>
-              </w:rPr>
-              <w:t>Diploma responsibility</w:t>
-            </w:r>
-          </w:p>
-        </w:tc>
-      </w:tr>
-      <w:tr>
-        <w:trPr>
-          <w:cantSplit/>
-        </w:trPr>
-        <w:tc>
-          <w:tcPr>
-            <w:tcW w:type="dxa" w:w="2592"/>
-            <w:vAlign w:val="center"/>
-            <w:shd w:fill="F1F5FA"/>
-            <w:tcMar>
-              <w:top w:w="90" w:type="dxa"/>
-              <w:left w:w="90" w:type="dxa"/>
-              <w:bottom w:w="90" w:type="dxa"/>
-              <w:right w:w="90" w:type="dxa"/>
-            </w:tcMar>
-          </w:tcPr>
-          <w:p>
-            <w:pPr>
-              <w:spacing w:after="40" w:before="40" w:line="245" w:lineRule="auto"/>
-            </w:pPr>
-            <w:r>
-              <w:rPr>
-                <w:b w:val="0"/>
-                <w:color w:val="18283E"/>
-                <w:sz w:val="19"/>
-              </w:rPr>
-              <w:t>Akhmetov Kazbek</w:t>
-            </w:r>
-          </w:p>
-        </w:tc>
-        <w:tc>
-          <w:tcPr>
-            <w:tcW w:type="dxa" w:w="7632"/>
-            <w:vAlign w:val="center"/>
-            <w:shd w:fill="F1F5FA"/>
-            <w:tcMar>
-              <w:top w:w="90" w:type="dxa"/>
-              <w:left w:w="90" w:type="dxa"/>
-              <w:bottom w:w="90" w:type="dxa"/>
-              <w:right w:w="90" w:type="dxa"/>
-            </w:tcMar>
-          </w:tcPr>
-          <w:p>
-            <w:pPr>
-              <w:spacing w:after="40" w:before="40" w:line="245" w:lineRule="auto"/>
-            </w:pPr>
-            <w:r>
-              <w:rPr>
-                <w:b w:val="0"/>
-                <w:color w:val="18283E"/>
-                <w:sz w:val="19"/>
-              </w:rPr>
-              <w:t>Frontend and backend integration, recording workflow, persisted review and exports</w:t>
-            </w:r>
-          </w:p>
-        </w:tc>
-      </w:tr>
-      <w:tr>
-        <w:trPr>
-          <w:cantSplit/>
-        </w:trPr>
-        <w:tc>
-          <w:tcPr>
-            <w:tcW w:type="dxa" w:w="2592"/>
-            <w:vAlign w:val="center"/>
-            <w:shd w:fill="FFFFFF"/>
-            <w:tcMar>
-              <w:top w:w="90" w:type="dxa"/>
-              <w:left w:w="90" w:type="dxa"/>
-              <w:bottom w:w="90" w:type="dxa"/>
-              <w:right w:w="90" w:type="dxa"/>
-            </w:tcMar>
-          </w:tcPr>
-          <w:p>
-            <w:pPr>
-              <w:spacing w:after="40" w:before="40" w:line="245" w:lineRule="auto"/>
-            </w:pPr>
-            <w:r>
-              <w:rPr>
-                <w:b w:val="0"/>
-                <w:color w:val="18283E"/>
-                <w:sz w:val="19"/>
-              </w:rPr>
-              <w:t>Uranov Daryn</w:t>
-            </w:r>
-          </w:p>
-        </w:tc>
-        <w:tc>
-          <w:tcPr>
-            <w:tcW w:type="dxa" w:w="7632"/>
-            <w:vAlign w:val="center"/>
-            <w:shd w:fill="FFFFFF"/>
-            <w:tcMar>
-              <w:top w:w="90" w:type="dxa"/>
-              <w:left w:w="90" w:type="dxa"/>
-              <w:bottom w:w="90" w:type="dxa"/>
-              <w:right w:w="90" w:type="dxa"/>
-            </w:tcMar>
-          </w:tcPr>
-          <w:p>
-            <w:pPr>
-              <w:spacing w:after="40" w:before="40" w:line="245" w:lineRule="auto"/>
-            </w:pPr>
-            <w:r>
-              <w:rPr>
-                <w:b w:val="0"/>
-                <w:color w:val="18283E"/>
-                <w:sz w:val="19"/>
-              </w:rPr>
-              <w:t>Speech and language models, diarization, evaluation data and reproducible experiments</w:t>
-            </w:r>
-          </w:p>
-        </w:tc>
-      </w:tr>
-      <w:tr>
-        <w:trPr>
-          <w:cantSplit/>
-        </w:trPr>
-        <w:tc>
-          <w:tcPr>
-            <w:tcW w:type="dxa" w:w="2592"/>
-            <w:vAlign w:val="center"/>
-            <w:shd w:fill="F1F5FA"/>
-            <w:tcMar>
-              <w:top w:w="90" w:type="dxa"/>
-              <w:left w:w="90" w:type="dxa"/>
-              <w:bottom w:w="90" w:type="dxa"/>
-              <w:right w:w="90" w:type="dxa"/>
-            </w:tcMar>
-          </w:tcPr>
-          <w:p>
-            <w:pPr>
-              <w:spacing w:after="40" w:before="40" w:line="245" w:lineRule="auto"/>
-            </w:pPr>
-            <w:r>
-              <w:rPr>
-                <w:b w:val="0"/>
-                <w:color w:val="18283E"/>
-                <w:sz w:val="19"/>
-              </w:rPr>
-              <w:t>Tazhibayev Marsel</w:t>
-            </w:r>
-          </w:p>
-        </w:tc>
-        <w:tc>
-          <w:tcPr>
-            <w:tcW w:type="dxa" w:w="7632"/>
-            <w:vAlign w:val="center"/>
-            <w:shd w:fill="F1F5FA"/>
-            <w:tcMar>
-              <w:top w:w="90" w:type="dxa"/>
-              <w:left w:w="90" w:type="dxa"/>
-              <w:bottom w:w="90" w:type="dxa"/>
-              <w:right w:w="90" w:type="dxa"/>
-            </w:tcMar>
-          </w:tcPr>
-          <w:p>
-            <w:pPr>
-              <w:spacing w:after="40" w:before="40" w:line="245" w:lineRule="auto"/>
-            </w:pPr>
-            <w:r>
-              <w:rPr>
-                <w:b w:val="0"/>
-                <w:color w:val="18283E"/>
-                <w:sz w:val="19"/>
-              </w:rPr>
-              <w:t>Team lead, shared contracts, scope, integration, review and submission coordination</w:t>
-            </w:r>
-          </w:p>
-        </w:tc>
-      </w:tr>
-    </w:tbl>
-    <w:p>
-      <w:pPr>
-        <w:spacing w:after="40"/>
-      </w:pPr>
-    </w:p>
-    <w:p>
-      <w:r>
-        <w:t>Supervisor: Elvira Aitmukhambetovna. The team reports that the topic is agreed. University/programme details and the final defense date remain to be supplied. Individual Git accounts must be mapped to these real names by the team; this report does not infer identity from nicknames.</w:t>
-      </w:r>
-    </w:p>
-    <w:p>
-      <w:pPr>
-        <w:pStyle w:val="Heading2"/>
-      </w:pPr>
-      <w:r>
-        <w:t>Problem and target users</w:t>
-      </w:r>
-    </w:p>
-    <w:p>
-      <w:r>
-        <w:t>Meeting coordinators and secretaries need to turn discussions into accurate summaries and actionable tasks. Code-switching, overlapping speech, uncertain names and relative dates can make automatic output unreliable. Published research establishes the relevance of evidence alignment and user correction [S06, S07, S28]. The repository records an omitted deadline and an incorrect summary in one model run [S35]. The prevalence and cost of these problems among Kazakhstan users remain to be established locally.</w:t>
-      </w:r>
-    </w:p>
-    <w:p>
-      <w:r>
-        <w:t>Primary users are coordinators, secretaries and project-team members who prepare minutes on a local computer. A human checks the resulting document before sharing it. The current application has no separate authenticated reviewer or administrator accounts. Local operating-system access is the security boundary; a shared web service is outside the delivered baseline.</w:t>
-      </w:r>
-    </w:p>
-    <w:p>
-      <w:pPr>
-        <w:pStyle w:val="Heading2"/>
-      </w:pPr>
-      <w:r>
-        <w:t>Aim and objectives</w:t>
-      </w:r>
-    </w:p>
-    <w:p>
-      <w:r>
-        <w:t>The aim is to develop and evaluate an offline-capable platform that reduces active preparation effort while producing reviewable Kazakh and Russian meeting minutes.</w:t>
-      </w:r>
-    </w:p>
-    <w:p>
-      <w:r>
-        <w:t>1. Establish user needs using published evidence and actual user discussions, with assumptions explicitly separated.</w:t>
-      </w:r>
-    </w:p>
-    <w:p>
-      <w:r>
-        <w:t>2. Preserve and document the working recording-to-DOCX flow and its local processing boundary.</w:t>
-      </w:r>
-    </w:p>
-    <w:p>
-      <w:r>
-        <w:t>3. Evaluate Kazakh, Russian and mixed-speech transcription and speaker attribution on independently annotated data.</w:t>
-      </w:r>
-    </w:p>
-    <w:p>
-      <w:r>
-        <w:t>4. Compare the current generator with feasible local alternatives and an extractive baseline using the same meeting tasks.</w:t>
-      </w:r>
-    </w:p>
-    <w:p>
-      <w:r>
-        <w:t>5. Improve measured errors in task owners, deadlines, evidence references and summary faithfulness.</w:t>
-      </w:r>
-    </w:p>
-    <w:p>
-      <w:r>
-        <w:t>6. Explore live meeting ingestion only after an explicit feasibility gate; retain upload as the working baseline.</w:t>
-      </w:r>
-    </w:p>
-    <w:p>
-      <w:pPr>
-        <w:pStyle w:val="Heading2"/>
-      </w:pPr>
-      <w:r>
-        <w:t>Implemented baseline and planned development</w:t>
-      </w:r>
-    </w:p>
-    <w:p>
-      <w:r>
-        <w:t>The baseline uses React/Vite with TypeScript, FastAPI, SQLite, local audio files and a separate Python worker. The bundled pipeline uses mixed-CTC speech recognition, sherpa-onnx speaker diarization and a 4-bit Qwen3-4B-Instruct-2507 checkpoint. Mac uses MLX; the Windows path executes the quantized checkpoint through a PyTorch adapter. Weights and hashes are pinned [S21, S33–S35].</w:t>
-      </w:r>
-    </w:p>
-    <w:p>
-      <w:r>
-        <w:t>Implemented input formats are WAV, MP3, M4A and FLAC with a default 100 MiB upload limit. The application preserves the machine result and the latest saved correction. Participants, tasks and summary are editable; transcript segments and source metadata are not editable in the current review API. Export uses one saved revision. This is a useful application, not a complete multiuser approval system.</w:t>
-      </w:r>
-    </w:p>
-    <w:p>
-      <w:r>
-        <w:t>Diploma extensions prioritise bilingual evaluation, error reduction, usable review and performance measurement. Live connection is planned research/development, not an implemented feature. The earlier 500 MB/60-minute specification is superseded by the actual baseline: 100 MiB; supported recording duration must be measured rather than claimed. Native mobile apps, several meeting providers and automatic external task execution remain outside the current scope.</w:t>
-      </w:r>
-    </w:p>
-    <w:p>
-      <w:pPr>
-        <w:pStyle w:val="Heading2"/>
-      </w:pPr>
-      <w:r>
-        <w:t>Expected outcomes and engineering contribution</w:t>
-      </w:r>
-    </w:p>
-    <w:p>
-      <w:r>
-        <w:t>Expected outcomes are a reproducible Hattama release, a coherent English documentation package, editable diagrams, a traceable task/review history and a controlled evaluation of accuracy, performance and user effort. The diploma contribution builds on the hackathon baseline through documented research, verified improvements and evaluation; it must not present inherited code as newly developed work.</w:t>
-      </w:r>
-    </w:p>
-    <w:p>
-      <w:r>
-        <w:t>Engineering complexity includes process isolation, durable queued jobs, audio decoding, model orchestration, source-linked task extraction, schema validation, transactional review revisions and consistent DOCX export. Neither a larger model nor a passing interface test proves minutes quality. The first pre-defense may present implementation plus an evaluation plan without claiming completed final experiments.</w:t>
-      </w:r>
-    </w:p>
-    <w:p>
-      <w:pPr>
-        <w:pStyle w:val="Heading1"/>
-      </w:pPr>
-      <w:r>
-        <w:t>Relevance and evidence of user needs</w:t>
-      </w:r>
-    </w:p>
-    <w:p>
-      <w:pPr>
-        <w:pStyle w:val="Heading2"/>
-      </w:pPr>
-      <w:r>
         <w:t>Evidence that is available</w:t>
       </w:r>
     </w:p>
     <w:p>
       <w:r>
-        <w:t>Three forms of evidence are kept separate: published studies, repository observations and direct user discovery. The topic agreement is reported by the team. No completed local interviews or client agreement have been supplied. The team reports permission to use constructed examples; such examples below are labelled illustrative and are not participant testimony. If the committee accepts an alternative to its written interview requirement, retain that explicit decision.</w:t>
+        <w:t>The evidence base combines published studies, repository observations and the team-reported hackathon achievement. The team reports winning a hackathon with Hattama and agreement on the diploma topic. The event name, date and award reference should be attached. Records of user discussions or a client agreement are needed to substantiate direct user discovery. The team reports permission to use constructed examples; such examples below are labelled illustrative and are not participant testimony. If the committee accepts an alternative to its written interview requirement, retain that explicit decision.</w:t>
       </w:r>
     </w:p>
     <w:tbl>
@@ -14040,7 +13897,7 @@
         <w:rPr>
           <w:sz w:val="20"/>
         </w:rPr>
-        <w:t>Supervisor: Elvira Aitmukhambetovna. The team reports that the topic has been agreed. No verbatim deliverable-specific review, signature or approval date has been supplied. The following is a prepared draft for the supervisor to edit or adopt, not a received endorsement. The team reports that drafting assistance is permitted; that permission does not establish that the supervisor has reviewed this version.</w:t>
+        <w:t>Supervisor: Aitmukhanbetova Elvira, Senior Lecturer. The team reports that the topic has been agreed. No verbatim deliverable-specific review, signature or approval date has been supplied. The following is a prepared draft for the supervisor to edit or adopt, not a received endorsement. The team reports that drafting assistance is permitted; that permission does not establish that the supervisor has reviewed this version.</w:t>
       </w:r>
     </w:p>
     <w:p>
@@ -20526,7 +20383,7 @@
         <w:rPr>
           <w:sz w:val="20"/>
         </w:rPr>
-        <w:t>1. Confirm university/programme details, actual submission/defense dates and the team account-to-name mapping. Topic agreement is already reported.</w:t>
+        <w:t>1. Confirm the exact submission/defense dates and the team account-to-name mapping. The title page uses Astana IT University, School of Software Engineering, Software Engineering, SE-2403 and 2026. Topic agreement is already reported.</w:t>
       </w:r>
     </w:p>
     <w:p>

</xml_diff>